<commit_message>
Astroum AI: React and TypeScript confirmed by him (journey); two résumé bullets, score 88.37
Co-Authored-By: Claude Opus 5.5 <noreply@anthropic.com>
</commit_message>
<xml_diff>
--- a/October-2026/02/astroum-ai-principal-lead-software-engineer/Abhisheik_Deo_Resume.docx
+++ b/October-2026/02/astroum-ai-principal-lead-software-engineer/Abhisheik_Deo_Resume.docx
@@ -823,7 +823,16 @@
         <w:t>in production</w:t>
       </w:r>
       <w:r>
-        <w:t xml:space="preserve"> for doctors, health coaches and guidance counsellors, answering cases short of 7 required fields with a plain cohort count</w:t>
+        <w:t xml:space="preserve"> on the </w:t>
+      </w:r>
+      <w:r>
+        <w:rPr>
+          <w:b/>
+        </w:rPr>
+        <w:t>React and TypeScript</w:t>
+      </w:r>
+      <w:r>
+        <w:t xml:space="preserve"> clinician web app, answering cases short of 7 required fields with a cohort count</w:t>
       </w:r>
     </w:p>
     <w:p>
@@ -1444,7 +1453,16 @@
         <w:pStyle w:val="ListBullet"/>
       </w:pPr>
       <w:r>
-        <w:t xml:space="preserve">Constructed comparable test runs in the axe DevTools browser extension, running axe-core on </w:t>
+        <w:t xml:space="preserve">Constructed comparable test runs in the </w:t>
+      </w:r>
+      <w:r>
+        <w:rPr>
+          <w:b/>
+        </w:rPr>
+        <w:t>React and TypeScript</w:t>
+      </w:r>
+      <w:r>
+        <w:t xml:space="preserve"> axe DevTools extension, running axe-core on </w:t>
       </w:r>
       <w:r>
         <w:rPr>
@@ -1453,7 +1471,7 @@
         <w:t>every page and user action</w:t>
       </w:r>
       <w:r>
-        <w:t xml:space="preserve"> in a flow, de-duplicating issues server-side</w:t>
+        <w:t>, de-duplicating issues server-side</w:t>
       </w:r>
     </w:p>
     <w:p>

</xml_diff>